<commit_message>
Add citation search upgrades and state supplement data
- Area filter chips for browsing/filtering citations by protocol area
- Synonym matching (~30 field-term groups) and match highlighting
- Protocol-area and question-level ranking hints ported from fs-reference-web
- Recent picks: last 10 selected citations shown when search is empty
- Citations index: 2,387 -> 6,445 (adds KY/MI/MN/MO/OR/TN/WA state supplements)
- build_citations.js: parse federal + state supplements, write www/ copy
- forest_locations.json: add two Umatilla NF sites
- SW: bump cache to v1.10 so devices refetch the larger citations JSON

Co-Authored-By: Claude Fable 5 <noreply@anthropic.com>
</commit_message>
<xml_diff>
--- a/Team Guide Cheat Sheet.docx
+++ b/Team Guide Cheat Sheet.docx
@@ -23,6 +23,50 @@
     </w:p>
     <w:p>
       <w:r>
+        <w:t>AE:</w:t>
+      </w:r>
+    </w:p>
+    <w:p>
+      <w:pPr>
+        <w:pStyle w:val="ListParagraph"/>
+        <w:numPr>
+          <w:ilvl w:val="0"/>
+          <w:numId w:val="7"/>
+        </w:numPr>
+      </w:pPr>
+      <w:r>
+        <w:t>BMP for R-22 being phased out: AE.2.2</w:t>
+      </w:r>
+    </w:p>
+    <w:p>
+      <w:pPr>
+        <w:pStyle w:val="ListParagraph"/>
+        <w:numPr>
+          <w:ilvl w:val="0"/>
+          <w:numId w:val="7"/>
+        </w:numPr>
+      </w:pPr>
+      <w:r>
+        <w:t>Prohibited Materials in the burn pile: AE.130.1</w:t>
+      </w:r>
+    </w:p>
+    <w:p>
+      <w:pPr>
+        <w:pStyle w:val="ListParagraph"/>
+        <w:numPr>
+          <w:ilvl w:val="0"/>
+          <w:numId w:val="7"/>
+        </w:numPr>
+      </w:pPr>
+      <w:r>
+        <w:t xml:space="preserve">Emergency Generator maintenance records and runtime logs missing: </w:t>
+      </w:r>
+      <w:r>
+        <w:t>AE.21.17</w:t>
+      </w:r>
+    </w:p>
+    <w:p>
+      <w:r>
         <w:t>HW:</w:t>
       </w:r>
     </w:p>
@@ -183,14 +227,12 @@
       </w:r>
     </w:p>
     <w:p>
-      <w:proofErr w:type="spellStart"/>
       <w:r>
         <w:t>Ha</w:t>
       </w:r>
       <w:r>
         <w:t>zCom</w:t>
       </w:r>
-      <w:proofErr w:type="spellEnd"/>
       <w:r>
         <w:t>:</w:t>
       </w:r>
@@ -203,13 +245,8 @@
           <w:numId w:val="5"/>
         </w:numPr>
       </w:pPr>
-      <w:proofErr w:type="spellStart"/>
-      <w:r>
-        <w:t>HazCom</w:t>
-      </w:r>
-      <w:proofErr w:type="spellEnd"/>
-      <w:r>
-        <w:t xml:space="preserve"> Plan Not Present/Needs Updating: HM.10.1</w:t>
+      <w:r>
+        <w:t>HazCom Plan Not Present/Needs Updating: HM.10.1</w:t>
       </w:r>
     </w:p>
     <w:p>
@@ -365,6 +402,7 @@
         </w:numPr>
       </w:pPr>
       <w:r>
+        <w:lastRenderedPageBreak/>
         <w:t xml:space="preserve">Backflow </w:t>
       </w:r>
       <w:r>
@@ -949,6 +987,119 @@
     <w:nsid w:val="638A6642"/>
     <w:multiLevelType w:val="hybridMultilevel"/>
     <w:tmpl w:val="7F208970"/>
+    <w:lvl w:ilvl="0" w:tplc="04090001">
+      <w:start w:val="1"/>
+      <w:numFmt w:val="bullet"/>
+      <w:lvlText w:val=""/>
+      <w:lvlJc w:val="left"/>
+      <w:pPr>
+        <w:ind w:left="720" w:hanging="360"/>
+      </w:pPr>
+      <w:rPr>
+        <w:rFonts w:ascii="Symbol" w:hAnsi="Symbol" w:hint="default"/>
+      </w:rPr>
+    </w:lvl>
+    <w:lvl w:ilvl="1" w:tplc="04090003" w:tentative="1">
+      <w:start w:val="1"/>
+      <w:numFmt w:val="bullet"/>
+      <w:lvlText w:val="o"/>
+      <w:lvlJc w:val="left"/>
+      <w:pPr>
+        <w:ind w:left="1440" w:hanging="360"/>
+      </w:pPr>
+      <w:rPr>
+        <w:rFonts w:ascii="Courier New" w:hAnsi="Courier New" w:cs="Courier New" w:hint="default"/>
+      </w:rPr>
+    </w:lvl>
+    <w:lvl w:ilvl="2" w:tplc="04090005" w:tentative="1">
+      <w:start w:val="1"/>
+      <w:numFmt w:val="bullet"/>
+      <w:lvlText w:val=""/>
+      <w:lvlJc w:val="left"/>
+      <w:pPr>
+        <w:ind w:left="2160" w:hanging="360"/>
+      </w:pPr>
+      <w:rPr>
+        <w:rFonts w:ascii="Wingdings" w:hAnsi="Wingdings" w:hint="default"/>
+      </w:rPr>
+    </w:lvl>
+    <w:lvl w:ilvl="3" w:tplc="04090001" w:tentative="1">
+      <w:start w:val="1"/>
+      <w:numFmt w:val="bullet"/>
+      <w:lvlText w:val=""/>
+      <w:lvlJc w:val="left"/>
+      <w:pPr>
+        <w:ind w:left="2880" w:hanging="360"/>
+      </w:pPr>
+      <w:rPr>
+        <w:rFonts w:ascii="Symbol" w:hAnsi="Symbol" w:hint="default"/>
+      </w:rPr>
+    </w:lvl>
+    <w:lvl w:ilvl="4" w:tplc="04090003" w:tentative="1">
+      <w:start w:val="1"/>
+      <w:numFmt w:val="bullet"/>
+      <w:lvlText w:val="o"/>
+      <w:lvlJc w:val="left"/>
+      <w:pPr>
+        <w:ind w:left="3600" w:hanging="360"/>
+      </w:pPr>
+      <w:rPr>
+        <w:rFonts w:ascii="Courier New" w:hAnsi="Courier New" w:cs="Courier New" w:hint="default"/>
+      </w:rPr>
+    </w:lvl>
+    <w:lvl w:ilvl="5" w:tplc="04090005" w:tentative="1">
+      <w:start w:val="1"/>
+      <w:numFmt w:val="bullet"/>
+      <w:lvlText w:val=""/>
+      <w:lvlJc w:val="left"/>
+      <w:pPr>
+        <w:ind w:left="4320" w:hanging="360"/>
+      </w:pPr>
+      <w:rPr>
+        <w:rFonts w:ascii="Wingdings" w:hAnsi="Wingdings" w:hint="default"/>
+      </w:rPr>
+    </w:lvl>
+    <w:lvl w:ilvl="6" w:tplc="04090001" w:tentative="1">
+      <w:start w:val="1"/>
+      <w:numFmt w:val="bullet"/>
+      <w:lvlText w:val=""/>
+      <w:lvlJc w:val="left"/>
+      <w:pPr>
+        <w:ind w:left="5040" w:hanging="360"/>
+      </w:pPr>
+      <w:rPr>
+        <w:rFonts w:ascii="Symbol" w:hAnsi="Symbol" w:hint="default"/>
+      </w:rPr>
+    </w:lvl>
+    <w:lvl w:ilvl="7" w:tplc="04090003" w:tentative="1">
+      <w:start w:val="1"/>
+      <w:numFmt w:val="bullet"/>
+      <w:lvlText w:val="o"/>
+      <w:lvlJc w:val="left"/>
+      <w:pPr>
+        <w:ind w:left="5760" w:hanging="360"/>
+      </w:pPr>
+      <w:rPr>
+        <w:rFonts w:ascii="Courier New" w:hAnsi="Courier New" w:cs="Courier New" w:hint="default"/>
+      </w:rPr>
+    </w:lvl>
+    <w:lvl w:ilvl="8" w:tplc="04090005" w:tentative="1">
+      <w:start w:val="1"/>
+      <w:numFmt w:val="bullet"/>
+      <w:lvlText w:val=""/>
+      <w:lvlJc w:val="left"/>
+      <w:pPr>
+        <w:ind w:left="6480" w:hanging="360"/>
+      </w:pPr>
+      <w:rPr>
+        <w:rFonts w:ascii="Wingdings" w:hAnsi="Wingdings" w:hint="default"/>
+      </w:rPr>
+    </w:lvl>
+  </w:abstractNum>
+  <w:abstractNum w:abstractNumId="6" w15:restartNumberingAfterBreak="0">
+    <w:nsid w:val="7765255F"/>
+    <w:multiLevelType w:val="hybridMultilevel"/>
+    <w:tmpl w:val="CCA45144"/>
     <w:lvl w:ilvl="0" w:tplc="04090001">
       <w:start w:val="1"/>
       <w:numFmt w:val="bullet"/>
@@ -1075,6 +1226,9 @@
   </w:num>
   <w:num w:numId="6" w16cid:durableId="585264792">
     <w:abstractNumId w:val="1"/>
+  </w:num>
+  <w:num w:numId="7" w16cid:durableId="1578052536">
+    <w:abstractNumId w:val="6"/>
   </w:num>
 </w:numbering>
 </file>
@@ -2315,26 +2469,6 @@
 </file>
 
 <file path=customXml/item1.xml><?xml version="1.0" encoding="utf-8"?>
-<?mso-contentType ?>
-<FormTemplates xmlns="http://schemas.microsoft.com/sharepoint/v3/contenttype/forms">
-  <Display>DocumentLibraryForm</Display>
-  <Edit>DocumentLibraryForm</Edit>
-  <New>DocumentLibraryForm</New>
-</FormTemplates>
-</file>
-
-<file path=customXml/item2.xml><?xml version="1.0" encoding="utf-8"?>
-<p:properties xmlns:p="http://schemas.microsoft.com/office/2006/metadata/properties" xmlns:xsi="http://www.w3.org/2001/XMLSchema-instance" xmlns:pc="http://schemas.microsoft.com/office/infopath/2007/PartnerControls">
-  <documentManagement>
-    <lcf76f155ced4ddcb4097134ff3c332f xmlns="7ee0b65d-8b31-4915-ab12-7cb1277c6de4">
-      <Terms xmlns="http://schemas.microsoft.com/office/infopath/2007/PartnerControls"/>
-    </lcf76f155ced4ddcb4097134ff3c332f>
-    <TaxCatchAll xmlns="1cb4e0d5-8358-488a-a9fc-5d9649b92364" xsi:nil="true"/>
-  </documentManagement>
-</p:properties>
-</file>
-
-<file path=customXml/item3.xml><?xml version="1.0" encoding="utf-8"?>
 <ct:contentTypeSchema xmlns:ct="http://schemas.microsoft.com/office/2006/metadata/contentType" xmlns:ma="http://schemas.microsoft.com/office/2006/metadata/properties/metaAttributes" ct:_="" ma:_="" ma:contentTypeName="Document" ma:contentTypeID="0x0101002BB0ADBCBD958248B50F4F0E9E9FB937" ma:contentTypeVersion="14" ma:contentTypeDescription="Create a new document." ma:contentTypeScope="" ma:versionID="c77d1aa02e014cb04b6f7c9ee76a7b8c">
   <xsd:schema xmlns:xsd="http://www.w3.org/2001/XMLSchema" xmlns:xs="http://www.w3.org/2001/XMLSchema" xmlns:p="http://schemas.microsoft.com/office/2006/metadata/properties" xmlns:ns2="7ee0b65d-8b31-4915-ab12-7cb1277c6de4" xmlns:ns3="1cb4e0d5-8358-488a-a9fc-5d9649b92364" targetNamespace="http://schemas.microsoft.com/office/2006/metadata/properties" ma:root="true" ma:fieldsID="df9723c94e11548d84717a0928e92e75" ns2:_="" ns3:_="">
     <xsd:import namespace="7ee0b65d-8b31-4915-ab12-7cb1277c6de4"/>
@@ -2547,10 +2681,41 @@
 </ct:contentTypeSchema>
 </file>
 
+<file path=customXml/item2.xml><?xml version="1.0" encoding="utf-8"?>
+<p:properties xmlns:p="http://schemas.microsoft.com/office/2006/metadata/properties" xmlns:xsi="http://www.w3.org/2001/XMLSchema-instance" xmlns:pc="http://schemas.microsoft.com/office/infopath/2007/PartnerControls">
+  <documentManagement>
+    <lcf76f155ced4ddcb4097134ff3c332f xmlns="7ee0b65d-8b31-4915-ab12-7cb1277c6de4">
+      <Terms xmlns="http://schemas.microsoft.com/office/infopath/2007/PartnerControls"/>
+    </lcf76f155ced4ddcb4097134ff3c332f>
+    <TaxCatchAll xmlns="1cb4e0d5-8358-488a-a9fc-5d9649b92364" xsi:nil="true"/>
+  </documentManagement>
+</p:properties>
+</file>
+
+<file path=customXml/item3.xml><?xml version="1.0" encoding="utf-8"?>
+<?mso-contentType ?>
+<FormTemplates xmlns="http://schemas.microsoft.com/sharepoint/v3/contenttype/forms">
+  <Display>DocumentLibraryForm</Display>
+  <Edit>DocumentLibraryForm</Edit>
+  <New>DocumentLibraryForm</New>
+</FormTemplates>
+</file>
+
 <file path=customXml/itemProps1.xml><?xml version="1.0" encoding="utf-8"?>
-<ds:datastoreItem xmlns:ds="http://schemas.openxmlformats.org/officeDocument/2006/customXml" ds:itemID="{862B896D-08D4-400E-96D7-BE5291AA8205}">
+<ds:datastoreItem xmlns:ds="http://schemas.openxmlformats.org/officeDocument/2006/customXml" ds:itemID="{18CC288B-32C1-460D-B400-D47B6F079056}">
   <ds:schemaRefs>
-    <ds:schemaRef ds:uri="http://schemas.microsoft.com/sharepoint/v3/contenttype/forms"/>
+    <ds:schemaRef ds:uri="http://schemas.microsoft.com/office/2006/metadata/contentType"/>
+    <ds:schemaRef ds:uri="http://schemas.microsoft.com/office/2006/metadata/properties/metaAttributes"/>
+    <ds:schemaRef ds:uri="http://www.w3.org/2001/XMLSchema"/>
+    <ds:schemaRef ds:uri="http://schemas.microsoft.com/office/2006/metadata/properties"/>
+    <ds:schemaRef ds:uri="7ee0b65d-8b31-4915-ab12-7cb1277c6de4"/>
+    <ds:schemaRef ds:uri="1cb4e0d5-8358-488a-a9fc-5d9649b92364"/>
+    <ds:schemaRef ds:uri="http://schemas.microsoft.com/office/2006/documentManagement/types"/>
+    <ds:schemaRef ds:uri="http://schemas.microsoft.com/office/infopath/2007/PartnerControls"/>
+    <ds:schemaRef ds:uri="http://schemas.openxmlformats.org/package/2006/metadata/core-properties"/>
+    <ds:schemaRef ds:uri="http://purl.org/dc/elements/1.1/"/>
+    <ds:schemaRef ds:uri="http://purl.org/dc/terms/"/>
+    <ds:schemaRef ds:uri="http://schemas.microsoft.com/internal/obd"/>
   </ds:schemaRefs>
 </ds:datastoreItem>
 </file>
@@ -2567,20 +2732,9 @@
 </file>
 
 <file path=customXml/itemProps3.xml><?xml version="1.0" encoding="utf-8"?>
-<ds:datastoreItem xmlns:ds="http://schemas.openxmlformats.org/officeDocument/2006/customXml" ds:itemID="{18CC288B-32C1-460D-B400-D47B6F079056}">
+<ds:datastoreItem xmlns:ds="http://schemas.openxmlformats.org/officeDocument/2006/customXml" ds:itemID="{862B896D-08D4-400E-96D7-BE5291AA8205}">
   <ds:schemaRefs>
-    <ds:schemaRef ds:uri="http://schemas.microsoft.com/office/2006/metadata/contentType"/>
-    <ds:schemaRef ds:uri="http://schemas.microsoft.com/office/2006/metadata/properties/metaAttributes"/>
-    <ds:schemaRef ds:uri="http://www.w3.org/2001/XMLSchema"/>
-    <ds:schemaRef ds:uri="http://schemas.microsoft.com/office/2006/metadata/properties"/>
-    <ds:schemaRef ds:uri="7ee0b65d-8b31-4915-ab12-7cb1277c6de4"/>
-    <ds:schemaRef ds:uri="1cb4e0d5-8358-488a-a9fc-5d9649b92364"/>
-    <ds:schemaRef ds:uri="http://schemas.microsoft.com/office/2006/documentManagement/types"/>
-    <ds:schemaRef ds:uri="http://schemas.microsoft.com/office/infopath/2007/PartnerControls"/>
-    <ds:schemaRef ds:uri="http://schemas.openxmlformats.org/package/2006/metadata/core-properties"/>
-    <ds:schemaRef ds:uri="http://purl.org/dc/elements/1.1/"/>
-    <ds:schemaRef ds:uri="http://purl.org/dc/terms/"/>
-    <ds:schemaRef ds:uri="http://schemas.microsoft.com/internal/obd"/>
+    <ds:schemaRef ds:uri="http://schemas.microsoft.com/sharepoint/v3/contenttype/forms"/>
   </ds:schemaRefs>
 </ds:datastoreItem>
 </file>
</xml_diff>